<commit_message>
lab7 asm, lab 4,6 physics
</commit_message>
<xml_diff>
--- a/physics/lab4/Фізика_ЛР-4_Цебринський_Назар_ІМ-44.docx
+++ b/physics/lab4/Фізика_ЛР-4_Цебринський_Назар_ІМ-44.docx
@@ -823,8 +823,8 @@
           <w:lang w:eastAsia="ru-RU"/>
         </w:rPr>
       </w:pPr>
-      <w:bookmarkStart w:id="2" w:name="p-rc_ae6b149053c78e59-104"/>
-      <w:bookmarkStart w:id="3" w:name="p-rc_ae6b149053c78e59-103_Copy_1"/>
+      <w:bookmarkStart w:id="2" w:name="p-rc_ae6b149053c78e59-103_Copy_1"/>
+      <w:bookmarkStart w:id="3" w:name="p-rc_ae6b149053c78e59-104"/>
       <w:bookmarkEnd w:id="2"/>
       <w:bookmarkEnd w:id="3"/>
       <w:r>
@@ -2126,9 +2126,9 @@
         <w:gridCol w:w="2680"/>
         <w:gridCol w:w="608"/>
         <w:gridCol w:w="609"/>
+        <w:gridCol w:w="608"/>
         <w:gridCol w:w="609"/>
-        <w:gridCol w:w="609"/>
-        <w:gridCol w:w="610"/>
+        <w:gridCol w:w="611"/>
         <w:gridCol w:w="609"/>
         <w:gridCol w:w="609"/>
         <w:gridCol w:w="608"/>
@@ -2221,7 +2221,7 @@
         </w:tc>
         <w:tc>
           <w:tcPr>
-            <w:tcW w:w="609" w:type="dxa"/>
+            <w:tcW w:w="608" w:type="dxa"/>
             <w:tcBorders>
               <w:top w:val="single" w:sz="2" w:space="0" w:color="000000"/>
               <w:start w:val="single" w:sz="2" w:space="0" w:color="000000"/>
@@ -2275,7 +2275,7 @@
         </w:tc>
         <w:tc>
           <w:tcPr>
-            <w:tcW w:w="610" w:type="dxa"/>
+            <w:tcW w:w="611" w:type="dxa"/>
             <w:tcBorders>
               <w:top w:val="single" w:sz="2" w:space="0" w:color="000000"/>
               <w:start w:val="single" w:sz="2" w:space="0" w:color="000000"/>
@@ -2499,7 +2499,7 @@
         </w:tc>
         <w:tc>
           <w:tcPr>
-            <w:tcW w:w="609" w:type="dxa"/>
+            <w:tcW w:w="608" w:type="dxa"/>
             <w:tcBorders>
               <w:top w:val="single" w:sz="2" w:space="0" w:color="000000"/>
               <w:start w:val="single" w:sz="2" w:space="0" w:color="000000"/>
@@ -2555,7 +2555,7 @@
         </w:tc>
         <w:tc>
           <w:tcPr>
-            <w:tcW w:w="610" w:type="dxa"/>
+            <w:tcW w:w="611" w:type="dxa"/>
             <w:tcBorders>
               <w:top w:val="single" w:sz="2" w:space="0" w:color="000000"/>
               <w:start w:val="single" w:sz="2" w:space="0" w:color="000000"/>
@@ -3106,7 +3106,7 @@
               <w:rPr>
                 <w:rFonts w:ascii="Google Sans Text;sans-serif" w:hAnsi="Google Sans Text;sans-serif"/>
               </w:rPr>
-              <w:t>6583</w:t>
+              <w:t>658,3</w:t>
             </w:r>
           </w:p>
         </w:tc>
@@ -3134,7 +3134,7 @@
               <w:rPr>
                 <w:rFonts w:ascii="Google Sans Text;sans-serif" w:hAnsi="Google Sans Text;sans-serif"/>
               </w:rPr>
-              <w:t>4721</w:t>
+              <w:t>472,1</w:t>
             </w:r>
           </w:p>
         </w:tc>
@@ -3162,7 +3162,7 @@
               <w:rPr>
                 <w:rFonts w:ascii="Google Sans Text;sans-serif" w:hAnsi="Google Sans Text;sans-serif"/>
               </w:rPr>
-              <w:t>4327</w:t>
+              <w:t>432,6</w:t>
             </w:r>
           </w:p>
         </w:tc>
@@ -3465,129 +3465,6 @@
                 <w:szCs w:val="28"/>
                 <w:lang w:eastAsia="ru-RU"/>
               </w:rPr>
-              <w:t xml:space="preserve">δk, % </w:t>
-            </w:r>
-          </w:p>
-        </w:tc>
-        <w:tc>
-          <w:tcPr>
-            <w:tcW w:w="794" w:type="dxa"/>
-            <w:tcBorders>
-              <w:top w:val="single" w:sz="2" w:space="0" w:color="000000"/>
-              <w:start w:val="single" w:sz="2" w:space="0" w:color="000000"/>
-              <w:bottom w:val="single" w:sz="2" w:space="0" w:color="000000"/>
-              <w:end w:val="single" w:sz="2" w:space="0" w:color="000000"/>
-            </w:tcBorders>
-            <w:vAlign w:val="center"/>
-          </w:tcPr>
-          <w:p>
-            <w:pPr>
-              <w:pStyle w:val="TableContents"/>
-              <w:spacing w:lineRule="auto" w:line="274" w:before="0" w:after="140"/>
-              <w:ind w:hanging="0" w:start="0" w:end="0"/>
-              <w:rPr>
-                <w:rFonts w:ascii="Google Sans Text;sans-serif" w:hAnsi="Google Sans Text;sans-serif"/>
-              </w:rPr>
-            </w:pPr>
-            <w:r>
-              <w:rPr>
-                <w:rFonts w:ascii="Google Sans Text;sans-serif" w:hAnsi="Google Sans Text;sans-serif"/>
-              </w:rPr>
-              <w:t>0,21</w:t>
-            </w:r>
-          </w:p>
-        </w:tc>
-        <w:tc>
-          <w:tcPr>
-            <w:tcW w:w="795" w:type="dxa"/>
-            <w:tcBorders>
-              <w:top w:val="single" w:sz="2" w:space="0" w:color="000000"/>
-              <w:start w:val="single" w:sz="2" w:space="0" w:color="000000"/>
-              <w:bottom w:val="single" w:sz="2" w:space="0" w:color="000000"/>
-              <w:end w:val="single" w:sz="2" w:space="0" w:color="000000"/>
-            </w:tcBorders>
-            <w:vAlign w:val="center"/>
-          </w:tcPr>
-          <w:p>
-            <w:pPr>
-              <w:pStyle w:val="TableContents"/>
-              <w:spacing w:lineRule="auto" w:line="274" w:before="0" w:after="140"/>
-              <w:ind w:hanging="0" w:start="0" w:end="0"/>
-              <w:rPr>
-                <w:rFonts w:ascii="Google Sans Text;sans-serif" w:hAnsi="Google Sans Text;sans-serif"/>
-              </w:rPr>
-            </w:pPr>
-            <w:r>
-              <w:rPr>
-                <w:rFonts w:ascii="Google Sans Text;sans-serif" w:hAnsi="Google Sans Text;sans-serif"/>
-              </w:rPr>
-              <w:t>4,74</w:t>
-            </w:r>
-          </w:p>
-        </w:tc>
-        <w:tc>
-          <w:tcPr>
-            <w:tcW w:w="839" w:type="dxa"/>
-            <w:tcBorders>
-              <w:top w:val="single" w:sz="2" w:space="0" w:color="000000"/>
-              <w:start w:val="single" w:sz="2" w:space="0" w:color="000000"/>
-              <w:bottom w:val="single" w:sz="2" w:space="0" w:color="000000"/>
-              <w:end w:val="single" w:sz="2" w:space="0" w:color="000000"/>
-            </w:tcBorders>
-            <w:vAlign w:val="center"/>
-          </w:tcPr>
-          <w:p>
-            <w:pPr>
-              <w:pStyle w:val="TableContents"/>
-              <w:spacing w:lineRule="auto" w:line="274" w:before="0" w:after="140"/>
-              <w:ind w:hanging="0" w:start="0" w:end="0"/>
-              <w:rPr>
-                <w:rFonts w:ascii="Google Sans Text;sans-serif" w:hAnsi="Google Sans Text;sans-serif"/>
-              </w:rPr>
-            </w:pPr>
-            <w:r>
-              <w:rPr>
-                <w:rFonts w:ascii="Google Sans Text;sans-serif" w:hAnsi="Google Sans Text;sans-serif"/>
-              </w:rPr>
-              <w:t>0,76</w:t>
-            </w:r>
-          </w:p>
-        </w:tc>
-      </w:tr>
-      <w:tr>
-        <w:trPr/>
-        <w:tc>
-          <w:tcPr>
-            <w:tcW w:w="4533" w:type="dxa"/>
-            <w:tcBorders>
-              <w:top w:val="single" w:sz="2" w:space="0" w:color="000000"/>
-              <w:start w:val="single" w:sz="2" w:space="0" w:color="000000"/>
-              <w:bottom w:val="single" w:sz="2" w:space="0" w:color="000000"/>
-              <w:end w:val="single" w:sz="2" w:space="0" w:color="000000"/>
-            </w:tcBorders>
-            <w:vAlign w:val="center"/>
-          </w:tcPr>
-          <w:p>
-            <w:pPr>
-              <w:pStyle w:val="Normal"/>
-              <w:widowControl/>
-              <w:spacing w:lineRule="auto" w:line="274" w:before="0" w:after="140"/>
-              <w:ind w:hanging="0" w:start="0" w:end="0"/>
-              <w:rPr>
-                <w:rFonts w:ascii="Google Sans Text;sans-serif" w:hAnsi="Google Sans Text;sans-serif" w:eastAsia="" w:eastAsiaTheme="minorEastAsia"/>
-                <w:sz w:val="28"/>
-                <w:szCs w:val="28"/>
-                <w:lang w:eastAsia="ru-RU"/>
-              </w:rPr>
-            </w:pPr>
-            <w:r>
-              <w:rPr>
-                <w:rFonts w:eastAsia="" w:ascii="Google Sans Text;sans-serif" w:hAnsi="Google Sans Text;sans-serif" w:eastAsiaTheme="minorEastAsia"/>
-                <w:b/>
-                <w:sz w:val="28"/>
-                <w:szCs w:val="28"/>
-                <w:lang w:eastAsia="ru-RU"/>
-              </w:rPr>
               <w:t xml:space="preserve">λteop​, A˚ </w:t>
             </w:r>
             <w:r>
@@ -3625,7 +3502,13 @@
               <w:rPr>
                 <w:rFonts w:ascii="Google Sans Text;sans-serif" w:hAnsi="Google Sans Text;sans-serif"/>
               </w:rPr>
-              <w:t>6561,1</w:t>
+              <w:t>656,</w:t>
+            </w:r>
+            <w:r>
+              <w:rPr>
+                <w:rFonts w:ascii="Google Sans Text;sans-serif" w:hAnsi="Google Sans Text;sans-serif"/>
+              </w:rPr>
+              <w:t>3</w:t>
             </w:r>
           </w:p>
         </w:tc>
@@ -3653,7 +3536,7 @@
               <w:rPr>
                 <w:rFonts w:ascii="Google Sans Text;sans-serif" w:hAnsi="Google Sans Text;sans-serif"/>
               </w:rPr>
-              <w:t>4860,1</w:t>
+              <w:t>486,1</w:t>
             </w:r>
           </w:p>
         </w:tc>
@@ -3681,139 +3564,19 @@
               <w:rPr>
                 <w:rFonts w:ascii="Google Sans Text;sans-serif" w:hAnsi="Google Sans Text;sans-serif"/>
               </w:rPr>
-              <w:t>4339,4</w:t>
-            </w:r>
-          </w:p>
-        </w:tc>
-      </w:tr>
-      <w:tr>
-        <w:trPr/>
-        <w:tc>
-          <w:tcPr>
-            <w:tcW w:w="4533" w:type="dxa"/>
-            <w:tcBorders>
-              <w:top w:val="single" w:sz="2" w:space="0" w:color="000000"/>
-              <w:start w:val="single" w:sz="2" w:space="0" w:color="000000"/>
-              <w:bottom w:val="single" w:sz="2" w:space="0" w:color="000000"/>
-              <w:end w:val="single" w:sz="2" w:space="0" w:color="000000"/>
-            </w:tcBorders>
-            <w:vAlign w:val="center"/>
-          </w:tcPr>
-          <w:p>
-            <w:pPr>
-              <w:pStyle w:val="Normal"/>
-              <w:widowControl/>
-              <w:spacing w:lineRule="auto" w:line="274" w:before="0" w:after="140"/>
-              <w:ind w:hanging="0" w:start="0" w:end="0"/>
-              <w:rPr>
-                <w:rFonts w:ascii="Google Sans Text;sans-serif" w:hAnsi="Google Sans Text;sans-serif" w:eastAsia="" w:eastAsiaTheme="minorEastAsia"/>
-                <w:sz w:val="28"/>
-                <w:szCs w:val="28"/>
-                <w:lang w:eastAsia="ru-RU"/>
-              </w:rPr>
-            </w:pPr>
-            <w:r>
-              <w:rPr>
-                <w:rFonts w:eastAsia="" w:ascii="Google Sans Text;sans-serif" w:hAnsi="Google Sans Text;sans-serif" w:eastAsiaTheme="minorEastAsia"/>
-                <w:b/>
-                <w:sz w:val="28"/>
-                <w:szCs w:val="28"/>
-                <w:lang w:eastAsia="ru-RU"/>
-              </w:rPr>
-              <w:t>δλ, %</w:t>
+              <w:t>43</w:t>
             </w:r>
             <w:r>
               <w:rPr>
-                <w:rFonts w:eastAsia="" w:ascii="Google Sans Text;sans-serif" w:hAnsi="Google Sans Text;sans-serif" w:eastAsiaTheme="minorEastAsia"/>
-                <w:sz w:val="28"/>
-                <w:szCs w:val="28"/>
-                <w:lang w:eastAsia="ru-RU"/>
-              </w:rPr>
-              <w:t xml:space="preserve"> </w:t>
+                <w:rFonts w:ascii="Google Sans Text;sans-serif" w:hAnsi="Google Sans Text;sans-serif"/>
+              </w:rPr>
+              <w:t>4</w:t>
             </w:r>
-          </w:p>
-        </w:tc>
-        <w:tc>
-          <w:tcPr>
-            <w:tcW w:w="794" w:type="dxa"/>
-            <w:tcBorders>
-              <w:top w:val="single" w:sz="2" w:space="0" w:color="000000"/>
-              <w:start w:val="single" w:sz="2" w:space="0" w:color="000000"/>
-              <w:bottom w:val="single" w:sz="2" w:space="0" w:color="000000"/>
-              <w:end w:val="single" w:sz="2" w:space="0" w:color="000000"/>
-            </w:tcBorders>
-            <w:vAlign w:val="center"/>
-          </w:tcPr>
-          <w:p>
-            <w:pPr>
-              <w:pStyle w:val="TableContents"/>
-              <w:spacing w:lineRule="auto" w:line="274" w:before="0" w:after="140"/>
-              <w:ind w:hanging="0" w:start="0" w:end="0"/>
+            <w:r>
               <w:rPr>
                 <w:rFonts w:ascii="Google Sans Text;sans-serif" w:hAnsi="Google Sans Text;sans-serif"/>
               </w:rPr>
-            </w:pPr>
-            <w:r>
-              <w:rPr>
-                <w:rFonts w:ascii="Google Sans Text;sans-serif" w:hAnsi="Google Sans Text;sans-serif"/>
-              </w:rPr>
-              <w:t>0,33</w:t>
-            </w:r>
-          </w:p>
-        </w:tc>
-        <w:tc>
-          <w:tcPr>
-            <w:tcW w:w="795" w:type="dxa"/>
-            <w:tcBorders>
-              <w:top w:val="single" w:sz="2" w:space="0" w:color="000000"/>
-              <w:start w:val="single" w:sz="2" w:space="0" w:color="000000"/>
-              <w:bottom w:val="single" w:sz="2" w:space="0" w:color="000000"/>
-              <w:end w:val="single" w:sz="2" w:space="0" w:color="000000"/>
-            </w:tcBorders>
-            <w:vAlign w:val="center"/>
-          </w:tcPr>
-          <w:p>
-            <w:pPr>
-              <w:pStyle w:val="TableContents"/>
-              <w:spacing w:lineRule="auto" w:line="274" w:before="0" w:after="140"/>
-              <w:ind w:hanging="0" w:start="0" w:end="0"/>
-              <w:rPr>
-                <w:rFonts w:ascii="Google Sans Text;sans-serif" w:hAnsi="Google Sans Text;sans-serif"/>
-              </w:rPr>
-            </w:pPr>
-            <w:r>
-              <w:rPr>
-                <w:rFonts w:ascii="Google Sans Text;sans-serif" w:hAnsi="Google Sans Text;sans-serif"/>
-              </w:rPr>
-              <w:t>2,86</w:t>
-            </w:r>
-          </w:p>
-        </w:tc>
-        <w:tc>
-          <w:tcPr>
-            <w:tcW w:w="839" w:type="dxa"/>
-            <w:tcBorders>
-              <w:top w:val="single" w:sz="2" w:space="0" w:color="000000"/>
-              <w:start w:val="single" w:sz="2" w:space="0" w:color="000000"/>
-              <w:bottom w:val="single" w:sz="2" w:space="0" w:color="000000"/>
-              <w:end w:val="single" w:sz="2" w:space="0" w:color="000000"/>
-            </w:tcBorders>
-            <w:vAlign w:val="center"/>
-          </w:tcPr>
-          <w:p>
-            <w:pPr>
-              <w:pStyle w:val="TableContents"/>
-              <w:spacing w:lineRule="auto" w:line="274" w:before="0" w:after="140"/>
-              <w:ind w:hanging="0" w:start="0" w:end="0"/>
-              <w:rPr>
-                <w:rFonts w:ascii="Google Sans Text;sans-serif" w:hAnsi="Google Sans Text;sans-serif"/>
-              </w:rPr>
-            </w:pPr>
-            <w:r>
-              <w:rPr>
-                <w:rFonts w:ascii="Google Sans Text;sans-serif" w:hAnsi="Google Sans Text;sans-serif"/>
-              </w:rPr>
-              <w:t>0,29</w:t>
+              <w:t>,4</w:t>
             </w:r>
           </w:p>
         </w:tc>
@@ -3907,6 +3670,110 @@
       <w:r>
         <w:rPr>
           <w:rFonts w:eastAsia="Times New Roman" w:ascii="Times New Roman" w:hAnsi="Times New Roman"/>
+          <w:iCs/>
+          <w:color w:val="000000"/>
+          <w:sz w:val="28"/>
+          <w:szCs w:val="28"/>
+          <w:lang w:eastAsia="ru-RU"/>
+        </w:rPr>
+      </w:r>
+    </w:p>
+    <w:p>
+      <w:pPr>
+        <w:pStyle w:val="Normal"/>
+        <w:spacing w:lineRule="auto" w:line="288" w:before="0" w:after="0"/>
+        <w:jc w:val="center"/>
+        <w:rPr>
+          <w:rFonts w:ascii="Times New Roman" w:hAnsi="Times New Roman" w:eastAsia="Times New Roman"/>
+          <w:b/>
+          <w:bCs/>
+          <w:iCs/>
+          <w:color w:val="000000"/>
+          <w:sz w:val="28"/>
+          <w:szCs w:val="28"/>
+          <w:lang w:eastAsia="ru-RU"/>
+        </w:rPr>
+      </w:pPr>
+      <w:r>
+        <w:rPr>
+          <w:rFonts w:eastAsia="Times New Roman" w:ascii="Times New Roman" w:hAnsi="Times New Roman"/>
+          <w:b/>
+          <w:bCs/>
+          <w:iCs/>
+          <w:color w:val="000000"/>
+          <w:sz w:val="28"/>
+          <w:szCs w:val="28"/>
+          <w:lang w:eastAsia="ru-RU"/>
+        </w:rPr>
+        <w:drawing>
+          <wp:anchor distT="0" distB="0" distL="0" distR="0" simplePos="0" relativeHeight="9" behindDoc="0" locked="0" layoutInCell="0" allowOverlap="1">
+            <wp:simplePos x="0" y="0"/>
+            <wp:positionH relativeFrom="column">
+              <wp:align>center</wp:align>
+            </wp:positionH>
+            <wp:positionV relativeFrom="paragraph">
+              <wp:posOffset>635</wp:posOffset>
+            </wp:positionV>
+            <wp:extent cx="5940425" cy="4177665"/>
+            <wp:effectExtent l="0" t="0" r="0" b="0"/>
+            <wp:wrapSquare wrapText="largest"/>
+            <wp:docPr id="5" name="Image6"/>
+            <wp:cNvGraphicFramePr>
+              <a:graphicFrameLocks xmlns:a="http://schemas.openxmlformats.org/drawingml/2006/main" noChangeAspect="1"/>
+            </wp:cNvGraphicFramePr>
+            <a:graphic xmlns:a="http://schemas.openxmlformats.org/drawingml/2006/main">
+              <a:graphicData uri="http://schemas.openxmlformats.org/drawingml/2006/picture">
+                <pic:pic xmlns:pic="http://schemas.openxmlformats.org/drawingml/2006/picture">
+                  <pic:nvPicPr>
+                    <pic:cNvPr id="5" name="Image6"/>
+                    <pic:cNvPicPr>
+                      <a:picLocks noChangeAspect="1" noChangeArrowheads="1"/>
+                    </pic:cNvPicPr>
+                  </pic:nvPicPr>
+                  <pic:blipFill>
+                    <a:blip r:embed="rId6"/>
+                    <a:stretch>
+                      <a:fillRect/>
+                    </a:stretch>
+                  </pic:blipFill>
+                  <pic:spPr bwMode="auto">
+                    <a:xfrm>
+                      <a:off x="0" y="0"/>
+                      <a:ext cx="5940425" cy="4177665"/>
+                    </a:xfrm>
+                    <a:prstGeom prst="rect">
+                      <a:avLst/>
+                    </a:prstGeom>
+                    <a:noFill/>
+                  </pic:spPr>
+                </pic:pic>
+              </a:graphicData>
+            </a:graphic>
+          </wp:anchor>
+        </w:drawing>
+      </w:r>
+    </w:p>
+    <w:p>
+      <w:pPr>
+        <w:pStyle w:val="Normal"/>
+        <w:spacing w:lineRule="auto" w:line="288" w:before="0" w:after="0"/>
+        <w:jc w:val="center"/>
+        <w:rPr>
+          <w:rFonts w:ascii="Times New Roman" w:hAnsi="Times New Roman" w:eastAsia="Times New Roman"/>
+          <w:b/>
+          <w:bCs/>
+          <w:iCs/>
+          <w:color w:val="000000"/>
+          <w:sz w:val="28"/>
+          <w:szCs w:val="28"/>
+          <w:lang w:eastAsia="ru-RU"/>
+        </w:rPr>
+      </w:pPr>
+      <w:r>
+        <w:rPr>
+          <w:rFonts w:eastAsia="Times New Roman" w:ascii="Times New Roman" w:hAnsi="Times New Roman"/>
+          <w:b/>
+          <w:bCs/>
           <w:iCs/>
           <w:color w:val="000000"/>
           <w:sz w:val="28"/>
@@ -4212,27 +4079,22 @@
         <w:jc w:val="start"/>
         <w:rPr>
           <w:rFonts w:ascii="Times New Roman" w:hAnsi="Times New Roman" w:eastAsia="Times New Roman"/>
-          <w:b/>
-          <w:bCs/>
-          <w:iCs/>
-          <w:color w:val="000000"/>
-          <w:sz w:val="28"/>
-          <w:szCs w:val="28"/>
-          <w:lang w:eastAsia="ru-RU"/>
-        </w:rPr>
-      </w:pPr>
-      <w:r>
-        <w:rPr>
-          <w:rFonts w:eastAsia="Times New Roman" w:ascii="Times New Roman" w:hAnsi="Times New Roman"/>
-          <w:b/>
-          <w:bCs/>
-          <w:iCs/>
-          <w:color w:val="000000"/>
-          <w:sz w:val="28"/>
-          <w:szCs w:val="28"/>
-          <w:lang w:eastAsia="ru-RU"/>
-        </w:rPr>
-        <w:t>Теоретична довжина хвилі:</w:t>
+          <w:iCs/>
+          <w:color w:val="000000"/>
+          <w:sz w:val="28"/>
+          <w:szCs w:val="28"/>
+          <w:lang w:eastAsia="ru-RU"/>
+        </w:rPr>
+      </w:pPr>
+      <w:r>
+        <w:rPr>
+          <w:rFonts w:eastAsia="Times New Roman" w:ascii="Times New Roman" w:hAnsi="Times New Roman"/>
+          <w:iCs/>
+          <w:color w:val="000000"/>
+          <w:sz w:val="28"/>
+          <w:szCs w:val="28"/>
+          <w:lang w:eastAsia="ru-RU"/>
+        </w:rPr>
       </w:r>
     </w:p>
     <w:p>
@@ -4250,106 +4112,16 @@
         </w:rPr>
       </w:pPr>
       <w:r>
-        <w:rPr/>
-      </w:r>
-      <m:oMathPara xmlns:m="http://schemas.openxmlformats.org/officeDocument/2006/math">
-        <m:oMathParaPr>
-          <m:jc m:val="left"/>
-        </m:oMathParaPr>
-        <m:oMath>
-          <m:sSub>
-            <m:e>
-              <m:r>
-                <m:t xml:space="preserve">λ</m:t>
-              </m:r>
-            </m:e>
-            <m:sub>
-              <m:r>
-                <m:rPr>
-                  <m:lit/>
-                  <m:nor/>
-                </m:rPr>
-                <m:t xml:space="preserve">теор</m:t>
-              </m:r>
-            </m:sub>
-          </m:sSub>
-          <m:r>
-            <m:rPr>
-              <m:lit/>
-              <m:nor/>
-            </m:rPr>
-            <m:t xml:space="preserve">=</m:t>
-          </m:r>
-          <m:f>
-            <m:num>
-              <m:r>
-                <m:t xml:space="preserve">1000</m:t>
-              </m:r>
-            </m:num>
-            <m:den>
-              <m:sSub>
-                <m:e>
-                  <m:r>
-                    <m:t xml:space="preserve">R</m:t>
-                  </m:r>
-                </m:e>
-                <m:sub>
-                  <m:r>
-                    <m:t xml:space="preserve">λ</m:t>
-                  </m:r>
-                </m:sub>
-              </m:sSub>
-              <m:r>
-                <m:t xml:space="preserve">⋅</m:t>
-              </m:r>
-              <m:d>
-                <m:dPr>
-                  <m:begChr m:val="("/>
-                  <m:endChr m:val=")"/>
-                </m:dPr>
-                <m:e>
-                  <m:r>
-                    <m:t xml:space="preserve">0,25</m:t>
-                  </m:r>
-                  <m:r>
-                    <m:t xml:space="preserve">−</m:t>
-                  </m:r>
-                  <m:f>
-                    <m:num>
-                      <m:r>
-                        <m:t xml:space="preserve">1</m:t>
-                      </m:r>
-                    </m:num>
-                    <m:den>
-                      <m:sSubSup>
-                        <m:e>
-                          <m:r>
-                            <m:t xml:space="preserve">k</m:t>
-                          </m:r>
-                        </m:e>
-                        <m:sub>
-                          <m:r>
-                            <m:rPr>
-                              <m:lit/>
-                              <m:nor/>
-                            </m:rPr>
-                            <m:t xml:space="preserve">округл</m:t>
-                          </m:r>
-                        </m:sub>
-                        <m:sup>
-                          <m:r>
-                            <m:t xml:space="preserve">2</m:t>
-                          </m:r>
-                        </m:sup>
-                      </m:sSubSup>
-                    </m:den>
-                  </m:f>
-                </m:e>
-              </m:d>
-            </m:den>
-          </m:f>
-        </m:oMath>
-      </m:oMathPara>
+        <w:rPr>
+          <w:rFonts w:eastAsia="Times New Roman" w:ascii="Times New Roman" w:hAnsi="Times New Roman"/>
+          <w:iCs/>
+          <w:color w:val="000000"/>
+          <w:sz w:val="28"/>
+          <w:szCs w:val="28"/>
+          <w:lang w:eastAsia="ru-RU"/>
+        </w:rPr>
+        <w:t>Похибки:</w:t>
+      </w:r>
     </w:p>
     <w:p>
       <w:pPr>
@@ -4366,153 +4138,61 @@
         </w:rPr>
       </w:pPr>
       <w:r>
-        <w:rPr/>
-      </w:r>
-      <m:oMathPara xmlns:m="http://schemas.openxmlformats.org/officeDocument/2006/math">
-        <m:oMathParaPr>
-          <m:jc m:val="left"/>
-        </m:oMathParaPr>
-        <m:oMath>
-          <m:sSub>
-            <m:e>
-              <m:r>
-                <m:t xml:space="preserve">λ</m:t>
-              </m:r>
-            </m:e>
-            <m:sub>
-              <m:r>
-                <m:rPr>
-                  <m:lit/>
-                  <m:nor/>
-                </m:rPr>
-                <m:t xml:space="preserve">теор</m:t>
-              </m:r>
-            </m:sub>
-          </m:sSub>
-          <m:r>
-            <m:rPr>
-              <m:lit/>
-              <m:nor/>
-            </m:rPr>
-            <m:t xml:space="preserve">=</m:t>
-          </m:r>
-          <m:f>
-            <m:num>
-              <m:r>
-                <m:t xml:space="preserve">1000</m:t>
-              </m:r>
-            </m:num>
-            <m:den>
-              <m:r>
-                <m:t xml:space="preserve">1,09737</m:t>
-              </m:r>
-              <m:r>
-                <m:t xml:space="preserve">⋅</m:t>
-              </m:r>
-              <m:d>
-                <m:dPr>
-                  <m:begChr m:val="("/>
-                  <m:endChr m:val=")"/>
-                </m:dPr>
-                <m:e>
-                  <m:r>
-                    <m:t xml:space="preserve">0,25</m:t>
-                  </m:r>
-                  <m:r>
-                    <m:t xml:space="preserve">−</m:t>
-                  </m:r>
-                  <m:f>
-                    <m:num>
-                      <m:r>
-                        <m:t xml:space="preserve">1</m:t>
-                      </m:r>
-                    </m:num>
-                    <m:den>
-                      <m:sSup>
-                        <m:e>
-                          <m:r>
-                            <m:t xml:space="preserve">3</m:t>
-                          </m:r>
-                        </m:e>
-                        <m:sup>
-                          <m:r>
-                            <m:t xml:space="preserve">2</m:t>
-                          </m:r>
-                        </m:sup>
-                      </m:sSup>
-                    </m:den>
-                  </m:f>
-                </m:e>
-              </m:d>
-            </m:den>
-          </m:f>
-          <m:r>
-            <m:rPr>
-              <m:lit/>
-              <m:nor/>
-            </m:rPr>
-            <m:t xml:space="preserve">=</m:t>
-          </m:r>
-          <m:f>
-            <m:num>
-              <m:r>
-                <m:t xml:space="preserve">1000</m:t>
-              </m:r>
-            </m:num>
-            <m:den>
-              <m:r>
-                <m:t xml:space="preserve">1,09737</m:t>
-              </m:r>
-              <m:r>
-                <m:t xml:space="preserve">⋅</m:t>
-              </m:r>
-              <m:d>
-                <m:dPr>
-                  <m:begChr m:val="("/>
-                  <m:endChr m:val=")"/>
-                </m:dPr>
-                <m:e>
-                  <m:r>
-                    <m:t xml:space="preserve">0,25</m:t>
-                  </m:r>
-                  <m:r>
-                    <m:t xml:space="preserve">−</m:t>
-                  </m:r>
-                  <m:f>
-                    <m:num>
-                      <m:r>
-                        <m:t xml:space="preserve">1</m:t>
-                      </m:r>
-                    </m:num>
-                    <m:den>
-                      <m:r>
-                        <m:t xml:space="preserve">9</m:t>
-                      </m:r>
-                    </m:den>
-                  </m:f>
-                </m:e>
-              </m:d>
-            </m:den>
-          </m:f>
-          <m:r>
-            <m:rPr>
-              <m:lit/>
-              <m:nor/>
-            </m:rPr>
-            <m:t xml:space="preserve">=</m:t>
-          </m:r>
-          <m:r>
-            <m:t xml:space="preserve">6561,1</m:t>
-          </m:r>
-          <m:r>
-            <m:rPr>
-              <m:lit/>
-              <m:nor/>
-            </m:rPr>
-            <m:t xml:space="preserve"> Å</m:t>
-          </m:r>
-        </m:oMath>
-      </m:oMathPara>
+        <w:rPr>
+          <w:rFonts w:eastAsia="Times New Roman" w:ascii="Times New Roman" w:hAnsi="Times New Roman"/>
+          <w:iCs/>
+          <w:color w:val="000000"/>
+          <w:sz w:val="28"/>
+          <w:szCs w:val="28"/>
+          <w:lang w:eastAsia="ru-RU"/>
+        </w:rPr>
+        <w:drawing>
+          <wp:anchor distT="0" distB="0" distL="0" distR="0" simplePos="0" relativeHeight="10" behindDoc="0" locked="0" layoutInCell="0" allowOverlap="1">
+            <wp:simplePos x="0" y="0"/>
+            <wp:positionH relativeFrom="column">
+              <wp:align>center</wp:align>
+            </wp:positionH>
+            <wp:positionV relativeFrom="paragraph">
+              <wp:posOffset>635</wp:posOffset>
+            </wp:positionV>
+            <wp:extent cx="1800225" cy="609600"/>
+            <wp:effectExtent l="0" t="0" r="0" b="0"/>
+            <wp:wrapSquare wrapText="largest"/>
+            <wp:docPr id="6" name="Image7"/>
+            <wp:cNvGraphicFramePr>
+              <a:graphicFrameLocks xmlns:a="http://schemas.openxmlformats.org/drawingml/2006/main" noChangeAspect="1"/>
+            </wp:cNvGraphicFramePr>
+            <a:graphic xmlns:a="http://schemas.openxmlformats.org/drawingml/2006/main">
+              <a:graphicData uri="http://schemas.openxmlformats.org/drawingml/2006/picture">
+                <pic:pic xmlns:pic="http://schemas.openxmlformats.org/drawingml/2006/picture">
+                  <pic:nvPicPr>
+                    <pic:cNvPr id="6" name="Image7"/>
+                    <pic:cNvPicPr>
+                      <a:picLocks noChangeAspect="1" noChangeArrowheads="1"/>
+                    </pic:cNvPicPr>
+                  </pic:nvPicPr>
+                  <pic:blipFill>
+                    <a:blip r:embed="rId7"/>
+                    <a:stretch>
+                      <a:fillRect/>
+                    </a:stretch>
+                  </pic:blipFill>
+                  <pic:spPr bwMode="auto">
+                    <a:xfrm>
+                      <a:off x="0" y="0"/>
+                      <a:ext cx="1800225" cy="609600"/>
+                    </a:xfrm>
+                    <a:prstGeom prst="rect">
+                      <a:avLst/>
+                    </a:prstGeom>
+                    <a:noFill/>
+                  </pic:spPr>
+                </pic:pic>
+              </a:graphicData>
+            </a:graphic>
+          </wp:anchor>
+        </w:drawing>
+      </w:r>
     </w:p>
     <w:p>
       <w:pPr>
@@ -4521,52 +4201,26 @@
         <w:jc w:val="start"/>
         <w:rPr>
           <w:rFonts w:ascii="Times New Roman" w:hAnsi="Times New Roman" w:eastAsia="Times New Roman"/>
-          <w:iCs/>
-          <w:color w:val="000000"/>
-          <w:sz w:val="28"/>
-          <w:szCs w:val="28"/>
-          <w:lang w:eastAsia="ru-RU"/>
-        </w:rPr>
-      </w:pPr>
-      <w:r>
-        <w:rPr>
-          <w:rFonts w:eastAsia="Times New Roman" w:ascii="Times New Roman" w:hAnsi="Times New Roman"/>
-          <w:b/>
-          <w:bCs/>
-          <w:iCs/>
-          <w:color w:val="000000"/>
-          <w:sz w:val="28"/>
-          <w:szCs w:val="28"/>
-          <w:lang w:eastAsia="ru-RU"/>
-        </w:rPr>
-        <w:t xml:space="preserve">Відносна похибка обчислення квантового числа </w:t>
-      </w:r>
-      <w:r>
-        <w:rPr>
-          <w:rStyle w:val="SourceText"/>
-          <w:rFonts w:ascii="Times New Roman" w:hAnsi="Times New Roman"/>
-          <w:b/>
-          <w:bCs/>
-          <w:iCs/>
-          <w:color w:val="000000"/>
-          <w:sz w:val="28"/>
-          <w:szCs w:val="28"/>
-          <w:lang w:eastAsia="ru-RU"/>
-        </w:rPr>
-        <w:t>δk</w:t>
-      </w:r>
-      <w:r>
-        <w:rPr>
-          <w:rFonts w:eastAsia="Times New Roman" w:ascii="Times New Roman" w:hAnsi="Times New Roman"/>
-          <w:b/>
-          <w:bCs/>
-          <w:iCs/>
-          <w:color w:val="000000"/>
-          <w:sz w:val="28"/>
-          <w:szCs w:val="28"/>
-          <w:lang w:eastAsia="ru-RU"/>
-        </w:rPr>
-        <w:t>:</w:t>
+          <w:b/>
+          <w:bCs/>
+          <w:iCs/>
+          <w:color w:val="000000"/>
+          <w:sz w:val="28"/>
+          <w:szCs w:val="28"/>
+          <w:lang w:eastAsia="ru-RU"/>
+        </w:rPr>
+      </w:pPr>
+      <w:r>
+        <w:rPr>
+          <w:rFonts w:eastAsia="Times New Roman" w:ascii="Times New Roman" w:hAnsi="Times New Roman"/>
+          <w:b/>
+          <w:bCs/>
+          <w:iCs/>
+          <w:color w:val="000000"/>
+          <w:sz w:val="28"/>
+          <w:szCs w:val="28"/>
+          <w:lang w:eastAsia="ru-RU"/>
+        </w:rPr>
       </w:r>
     </w:p>
     <w:p>
@@ -4586,189 +4240,117 @@
         </w:rPr>
       </w:pPr>
       <w:r>
-        <w:rPr/>
-      </w:r>
-      <m:oMathPara xmlns:m="http://schemas.openxmlformats.org/officeDocument/2006/math">
-        <m:oMathParaPr>
-          <m:jc m:val="left"/>
-        </m:oMathParaPr>
-        <m:oMath>
-          <m:r>
-            <m:t xml:space="preserve">δ</m:t>
-          </m:r>
-          <m:r>
-            <m:t xml:space="preserve">k</m:t>
-          </m:r>
-          <m:r>
-            <m:rPr>
-              <m:lit/>
-              <m:nor/>
-            </m:rPr>
-            <m:t xml:space="preserve">=</m:t>
-          </m:r>
-          <m:f>
-            <m:num>
-              <m:d>
-                <m:dPr>
-                  <m:begChr m:val="|"/>
-                  <m:endChr m:val="|"/>
-                </m:dPr>
-                <m:e>
-                  <m:r>
-                    <m:t xml:space="preserve">k</m:t>
-                  </m:r>
-                  <m:r>
-                    <m:t xml:space="preserve">−</m:t>
-                  </m:r>
-                  <m:sSub>
-                    <m:e>
-                      <m:r>
-                        <m:t xml:space="preserve">k</m:t>
-                      </m:r>
-                    </m:e>
-                    <m:sub>
-                      <m:r>
-                        <m:rPr>
-                          <m:lit/>
-                          <m:nor/>
-                        </m:rPr>
-                        <m:t xml:space="preserve">округл</m:t>
-                      </m:r>
-                    </m:sub>
-                  </m:sSub>
-                </m:e>
-              </m:d>
-            </m:num>
-            <m:den>
-              <m:sSub>
-                <m:e>
-                  <m:r>
-                    <m:t xml:space="preserve">k</m:t>
-                  </m:r>
-                </m:e>
-                <m:sub>
-                  <m:r>
-                    <m:rPr>
-                      <m:lit/>
-                      <m:nor/>
-                    </m:rPr>
-                    <m:t xml:space="preserve">округл</m:t>
-                  </m:r>
-                </m:sub>
-              </m:sSub>
-            </m:den>
-          </m:f>
-          <m:r>
-            <m:t xml:space="preserve">⋅</m:t>
-          </m:r>
-          <m:r>
-            <m:t xml:space="preserve">100</m:t>
-          </m:r>
-          <m:r>
-            <m:rPr>
-              <m:lit/>
-              <m:nor/>
-            </m:rPr>
-            <m:t xml:space="preserve">%</m:t>
-          </m:r>
-        </m:oMath>
-      </m:oMathPara>
-    </w:p>
-    <w:p>
-      <w:pPr>
-        <w:pStyle w:val="Normal"/>
+        <w:rPr>
+          <w:rFonts w:eastAsia="Times New Roman" w:ascii="Times New Roman" w:hAnsi="Times New Roman"/>
+          <w:b/>
+          <w:bCs/>
+          <w:iCs/>
+          <w:color w:val="000000"/>
+          <w:sz w:val="28"/>
+          <w:szCs w:val="28"/>
+          <w:lang w:eastAsia="ru-RU"/>
+        </w:rPr>
+      </w:r>
+    </w:p>
+    <w:p>
+      <w:pPr>
+        <w:pStyle w:val="BodyText"/>
+        <w:numPr>
+          <w:ilvl w:val="0"/>
+          <w:numId w:val="5"/>
+        </w:numPr>
         <w:spacing w:lineRule="auto" w:line="288" w:before="0" w:after="0"/>
         <w:jc w:val="start"/>
         <w:rPr>
-          <w:rFonts w:ascii="Times New Roman" w:hAnsi="Times New Roman" w:eastAsia="Times New Roman"/>
-          <w:b/>
-          <w:bCs/>
-          <w:iCs/>
-          <w:color w:val="000000"/>
-          <w:sz w:val="28"/>
-          <w:szCs w:val="28"/>
-          <w:lang w:eastAsia="ru-RU"/>
-        </w:rPr>
-      </w:pPr>
-      <w:r>
-        <w:rPr/>
-      </w:r>
-      <m:oMathPara xmlns:m="http://schemas.openxmlformats.org/officeDocument/2006/math">
-        <m:oMathParaPr>
-          <m:jc m:val="left"/>
-        </m:oMathParaPr>
-        <m:oMath>
-          <m:r>
-            <m:t xml:space="preserve">δ</m:t>
-          </m:r>
-          <m:r>
-            <m:t xml:space="preserve">k</m:t>
-          </m:r>
-          <m:r>
-            <m:rPr>
-              <m:lit/>
-              <m:nor/>
-            </m:rPr>
-            <m:t xml:space="preserve">=</m:t>
-          </m:r>
-          <m:f>
-            <m:num>
-              <m:d>
-                <m:dPr>
-                  <m:begChr m:val="|"/>
-                  <m:endChr m:val="|"/>
-                </m:dPr>
-                <m:e>
-                  <m:r>
-                    <m:t xml:space="preserve">2,99</m:t>
-                  </m:r>
-                  <m:r>
-                    <m:t xml:space="preserve">−</m:t>
-                  </m:r>
-                  <m:r>
-                    <m:t xml:space="preserve">3</m:t>
-                  </m:r>
-                </m:e>
-              </m:d>
-            </m:num>
-            <m:den>
-              <m:r>
-                <m:t xml:space="preserve">3</m:t>
-              </m:r>
-            </m:den>
-          </m:f>
-          <m:r>
-            <m:t xml:space="preserve">⋅</m:t>
-          </m:r>
-          <m:r>
-            <m:t xml:space="preserve">100</m:t>
-          </m:r>
-          <m:r>
-            <m:rPr>
-              <m:lit/>
-              <m:nor/>
-            </m:rPr>
-            <m:t xml:space="preserve">%</m:t>
-          </m:r>
-          <m:r>
-            <m:rPr>
-              <m:lit/>
-              <m:nor/>
-            </m:rPr>
-            <m:t xml:space="preserve">=</m:t>
-          </m:r>
-          <m:r>
-            <m:t xml:space="preserve">0,21</m:t>
-          </m:r>
-          <m:r>
-            <m:rPr>
-              <m:lit/>
-              <m:nor/>
-            </m:rPr>
-            <m:t xml:space="preserve">%</m:t>
-          </m:r>
-        </m:oMath>
-      </m:oMathPara>
+          <w:rFonts w:ascii="Google Sans Text;sans-serif" w:hAnsi="Google Sans Text;sans-serif" w:eastAsia="Times New Roman"/>
+          <w:b/>
+          <w:bCs/>
+          <w:iCs/>
+          <w:color w:val="000000"/>
+          <w:sz w:val="28"/>
+          <w:szCs w:val="28"/>
+          <w:lang w:eastAsia="ru-RU"/>
+        </w:rPr>
+      </w:pPr>
+      <w:r>
+        <w:rPr>
+          <w:rFonts w:eastAsia="Times New Roman" w:ascii="Google Sans Text;sans-serif" w:hAnsi="Google Sans Text;sans-serif"/>
+          <w:b/>
+          <w:bCs/>
+          <w:iCs/>
+          <w:color w:val="000000"/>
+          <w:sz w:val="28"/>
+          <w:szCs w:val="28"/>
+          <w:lang w:eastAsia="ru-RU"/>
+        </w:rPr>
+        <w:t>Для червоного: 0,30%</w:t>
+      </w:r>
+    </w:p>
+    <w:p>
+      <w:pPr>
+        <w:pStyle w:val="BodyText"/>
+        <w:numPr>
+          <w:ilvl w:val="0"/>
+          <w:numId w:val="5"/>
+        </w:numPr>
+        <w:spacing w:lineRule="auto" w:line="274" w:before="0" w:after="140"/>
+        <w:rPr>
+          <w:rFonts w:ascii="Google Sans Text;sans-serif" w:hAnsi="Google Sans Text;sans-serif" w:eastAsia="Times New Roman"/>
+          <w:b/>
+          <w:bCs/>
+          <w:iCs/>
+          <w:color w:val="000000"/>
+          <w:sz w:val="28"/>
+          <w:szCs w:val="28"/>
+          <w:lang w:eastAsia="ru-RU"/>
+        </w:rPr>
+      </w:pPr>
+      <w:r>
+        <w:rPr>
+          <w:rFonts w:eastAsia="Times New Roman" w:ascii="Google Sans Text;sans-serif" w:hAnsi="Google Sans Text;sans-serif"/>
+          <w:b/>
+          <w:bCs/>
+          <w:iCs/>
+          <w:color w:val="000000"/>
+          <w:sz w:val="28"/>
+          <w:szCs w:val="28"/>
+          <w:lang w:eastAsia="ru-RU"/>
+        </w:rPr>
+        <w:t>Для блакитного: 2,88%</w:t>
+      </w:r>
+    </w:p>
+    <w:p>
+      <w:pPr>
+        <w:pStyle w:val="BodyText"/>
+        <w:numPr>
+          <w:ilvl w:val="0"/>
+          <w:numId w:val="5"/>
+        </w:numPr>
+        <w:spacing w:lineRule="auto" w:line="274" w:before="0" w:after="140"/>
+        <w:rPr>
+          <w:rFonts w:ascii="Google Sans Text;sans-serif" w:hAnsi="Google Sans Text;sans-serif" w:eastAsia="Times New Roman"/>
+          <w:b/>
+          <w:bCs/>
+          <w:iCs/>
+          <w:color w:val="000000"/>
+          <w:sz w:val="28"/>
+          <w:szCs w:val="28"/>
+          <w:lang w:eastAsia="ru-RU"/>
+        </w:rPr>
+      </w:pPr>
+      <w:r>
+        <w:rPr>
+          <w:rFonts w:eastAsia="Times New Roman" w:ascii="Google Sans Text;sans-serif" w:hAnsi="Google Sans Text;sans-serif"/>
+          <w:b/>
+          <w:bCs/>
+          <w:iCs/>
+          <w:color w:val="000000"/>
+          <w:sz w:val="28"/>
+          <w:szCs w:val="28"/>
+          <w:lang w:eastAsia="ru-RU"/>
+        </w:rPr>
+        <w:t>Для синього: 0,41%</w:t>
+      </w:r>
     </w:p>
     <w:p>
       <w:pPr>
@@ -4797,236 +4379,7 @@
           <w:szCs w:val="28"/>
           <w:lang w:eastAsia="ru-RU"/>
         </w:rPr>
-        <w:t xml:space="preserve">Відносна похибка довжини хвилі </w:t>
-      </w:r>
-      <w:r>
-        <w:rPr>
-          <w:rStyle w:val="SourceText"/>
-          <w:rFonts w:ascii="Times New Roman" w:hAnsi="Times New Roman"/>
-          <w:b/>
-          <w:bCs/>
-          <w:iCs/>
-          <w:color w:val="000000"/>
-          <w:sz w:val="28"/>
-          <w:szCs w:val="28"/>
-          <w:lang w:eastAsia="ru-RU"/>
-        </w:rPr>
-        <w:t>δλ</w:t>
-      </w:r>
-      <w:r>
-        <w:rPr>
-          <w:rFonts w:eastAsia="Times New Roman" w:ascii="Times New Roman" w:hAnsi="Times New Roman"/>
-          <w:b/>
-          <w:bCs/>
-          <w:iCs/>
-          <w:color w:val="000000"/>
-          <w:sz w:val="28"/>
-          <w:szCs w:val="28"/>
-          <w:lang w:eastAsia="ru-RU"/>
-        </w:rPr>
-        <w:t>:</w:t>
-      </w:r>
-    </w:p>
-    <w:p>
-      <w:pPr>
-        <w:pStyle w:val="Normal"/>
-        <w:spacing w:lineRule="auto" w:line="288" w:before="0" w:after="0"/>
-        <w:jc w:val="start"/>
-        <w:rPr>
-          <w:rFonts w:ascii="Times New Roman" w:hAnsi="Times New Roman" w:eastAsia="Times New Roman"/>
-          <w:b/>
-          <w:bCs/>
-          <w:iCs/>
-          <w:color w:val="000000"/>
-          <w:sz w:val="28"/>
-          <w:szCs w:val="28"/>
-          <w:lang w:eastAsia="ru-RU"/>
-        </w:rPr>
-      </w:pPr>
-      <w:r>
-        <w:rPr/>
-      </w:r>
-      <m:oMathPara xmlns:m="http://schemas.openxmlformats.org/officeDocument/2006/math">
-        <m:oMathParaPr>
-          <m:jc m:val="left"/>
-        </m:oMathParaPr>
-        <m:oMath>
-          <m:r>
-            <m:t xml:space="preserve">δ</m:t>
-          </m:r>
-          <m:r>
-            <m:t xml:space="preserve">λ</m:t>
-          </m:r>
-          <m:r>
-            <m:rPr>
-              <m:lit/>
-              <m:nor/>
-            </m:rPr>
-            <m:t xml:space="preserve">=</m:t>
-          </m:r>
-          <m:f>
-            <m:num>
-              <m:d>
-                <m:dPr>
-                  <m:begChr m:val="|"/>
-                  <m:endChr m:val="|"/>
-                </m:dPr>
-                <m:e>
-                  <m:r>
-                    <m:t xml:space="preserve">λ</m:t>
-                  </m:r>
-                  <m:r>
-                    <m:t xml:space="preserve">−</m:t>
-                  </m:r>
-                  <m:sSub>
-                    <m:e>
-                      <m:r>
-                        <m:t xml:space="preserve">λ</m:t>
-                      </m:r>
-                    </m:e>
-                    <m:sub>
-                      <m:r>
-                        <m:rPr>
-                          <m:lit/>
-                          <m:nor/>
-                        </m:rPr>
-                        <m:t xml:space="preserve">теор</m:t>
-                      </m:r>
-                    </m:sub>
-                  </m:sSub>
-                </m:e>
-              </m:d>
-            </m:num>
-            <m:den>
-              <m:sSub>
-                <m:e>
-                  <m:r>
-                    <m:t xml:space="preserve">λ</m:t>
-                  </m:r>
-                </m:e>
-                <m:sub>
-                  <m:r>
-                    <m:rPr>
-                      <m:lit/>
-                      <m:nor/>
-                    </m:rPr>
-                    <m:t xml:space="preserve">теор</m:t>
-                  </m:r>
-                </m:sub>
-              </m:sSub>
-            </m:den>
-          </m:f>
-          <m:r>
-            <m:t xml:space="preserve">⋅</m:t>
-          </m:r>
-          <m:r>
-            <m:t xml:space="preserve">100</m:t>
-          </m:r>
-          <m:r>
-            <m:rPr>
-              <m:lit/>
-              <m:nor/>
-            </m:rPr>
-            <m:t xml:space="preserve">%</m:t>
-          </m:r>
-        </m:oMath>
-      </m:oMathPara>
-    </w:p>
-    <w:p>
-      <w:pPr>
-        <w:pStyle w:val="Normal"/>
-        <w:spacing w:lineRule="auto" w:line="288" w:before="0" w:after="0"/>
-        <w:jc w:val="start"/>
-        <w:rPr>
-          <w:rFonts w:ascii="Times New Roman" w:hAnsi="Times New Roman" w:eastAsia="Times New Roman"/>
-          <w:b/>
-          <w:bCs/>
-          <w:iCs/>
-          <w:color w:val="000000"/>
-          <w:sz w:val="28"/>
-          <w:szCs w:val="28"/>
-          <w:lang w:eastAsia="ru-RU"/>
-        </w:rPr>
-      </w:pPr>
-      <w:r>
-        <w:rPr/>
-      </w:r>
-      <m:oMathPara xmlns:m="http://schemas.openxmlformats.org/officeDocument/2006/math">
-        <m:oMathParaPr>
-          <m:jc m:val="left"/>
-        </m:oMathParaPr>
-        <m:oMath>
-          <m:r>
-            <m:t xml:space="preserve">δ</m:t>
-          </m:r>
-          <m:r>
-            <m:t xml:space="preserve">λ</m:t>
-          </m:r>
-          <m:r>
-            <m:rPr>
-              <m:lit/>
-              <m:nor/>
-            </m:rPr>
-            <m:t xml:space="preserve">=</m:t>
-          </m:r>
-          <m:f>
-            <m:num>
-              <m:d>
-                <m:dPr>
-                  <m:begChr m:val="|"/>
-                  <m:endChr m:val="|"/>
-                </m:dPr>
-                <m:e>
-                  <m:r>
-                    <m:t xml:space="preserve">6583</m:t>
-                  </m:r>
-                  <m:r>
-                    <m:t xml:space="preserve">−</m:t>
-                  </m:r>
-                  <m:r>
-                    <m:t xml:space="preserve">6561,1</m:t>
-                  </m:r>
-                </m:e>
-              </m:d>
-            </m:num>
-            <m:den>
-              <m:r>
-                <m:t xml:space="preserve">6561,1</m:t>
-              </m:r>
-            </m:den>
-          </m:f>
-          <m:r>
-            <m:t xml:space="preserve">⋅</m:t>
-          </m:r>
-          <m:r>
-            <m:t xml:space="preserve">100</m:t>
-          </m:r>
-          <m:r>
-            <m:rPr>
-              <m:lit/>
-              <m:nor/>
-            </m:rPr>
-            <m:t xml:space="preserve">%</m:t>
-          </m:r>
-          <m:r>
-            <m:rPr>
-              <m:lit/>
-              <m:nor/>
-            </m:rPr>
-            <m:t xml:space="preserve">=</m:t>
-          </m:r>
-          <m:r>
-            <m:t xml:space="preserve">0,33</m:t>
-          </m:r>
-          <m:r>
-            <m:rPr>
-              <m:lit/>
-              <m:nor/>
-            </m:rPr>
-            <m:t xml:space="preserve">%</m:t>
-          </m:r>
-        </m:oMath>
-      </m:oMathPara>
+      </w:r>
     </w:p>
     <w:p>
       <w:pPr>
@@ -5271,7 +4624,51 @@
           <w:szCs w:val="28"/>
           <w:lang w:eastAsia="ru-RU"/>
         </w:rPr>
-        <w:t>Порівняння експериментально визначених довжин хвиль із теоретичними значеннями (розрахованими за узагальненою формулою Бальмера) продемонструвало високу точність експерименту: відносні похибки склали від 0,29% до 2,86%. Це повністю підтверджує достовірність квантово-механічної теорії будови атома водню Бора.</w:t>
+        <w:t>Порівняння експериментально визначених довжин хвиль із теоретичними значеннями (розрахованими за узагальненою формулою Бальмера) продемонструвало високу точність експерименту: відносні похибки склали від 0,</w:t>
+      </w:r>
+      <w:r>
+        <w:rPr>
+          <w:rFonts w:eastAsia="Times New Roman" w:ascii="Times New Roman" w:hAnsi="Times New Roman"/>
+          <w:iCs/>
+          <w:color w:val="000000"/>
+          <w:sz w:val="28"/>
+          <w:szCs w:val="28"/>
+          <w:lang w:eastAsia="ru-RU"/>
+        </w:rPr>
+        <w:t>30</w:t>
+      </w:r>
+      <w:r>
+        <w:rPr>
+          <w:rFonts w:eastAsia="Times New Roman" w:ascii="Times New Roman" w:hAnsi="Times New Roman"/>
+          <w:iCs/>
+          <w:color w:val="000000"/>
+          <w:sz w:val="28"/>
+          <w:szCs w:val="28"/>
+          <w:lang w:eastAsia="ru-RU"/>
+        </w:rPr>
+        <w:t>% до 2,8</w:t>
+      </w:r>
+      <w:r>
+        <w:rPr>
+          <w:rFonts w:eastAsia="Times New Roman" w:ascii="Times New Roman" w:hAnsi="Times New Roman"/>
+          <w:iCs/>
+          <w:color w:val="000000"/>
+          <w:sz w:val="28"/>
+          <w:szCs w:val="28"/>
+          <w:lang w:eastAsia="ru-RU"/>
+        </w:rPr>
+        <w:t>8</w:t>
+      </w:r>
+      <w:r>
+        <w:rPr>
+          <w:rFonts w:eastAsia="Times New Roman" w:ascii="Times New Roman" w:hAnsi="Times New Roman"/>
+          <w:iCs/>
+          <w:color w:val="000000"/>
+          <w:sz w:val="28"/>
+          <w:szCs w:val="28"/>
+          <w:lang w:eastAsia="ru-RU"/>
+        </w:rPr>
+        <w:t>%. Це повністю підтверджує достовірність квантово-механічної теорії будови атома водню Бора.</w:t>
       </w:r>
     </w:p>
     <w:p>
@@ -5331,58 +4728,805 @@
       <w:pPr>
         <w:pStyle w:val="Normal"/>
         <w:spacing w:lineRule="auto" w:line="288" w:before="0" w:after="0"/>
-        <w:ind w:firstLine="720"/>
-        <w:jc w:val="center"/>
-        <w:rPr>
-          <w:rFonts w:ascii="Times New Roman" w:hAnsi="Times New Roman" w:eastAsia="Times New Roman"/>
-          <w:iCs/>
-          <w:color w:val="000000"/>
-          <w:sz w:val="28"/>
-          <w:szCs w:val="28"/>
-          <w:lang w:eastAsia="ru-RU"/>
-        </w:rPr>
-      </w:pPr>
-      <w:r>
-        <w:rPr>
-          <w:rFonts w:eastAsia="Times New Roman" w:ascii="Times New Roman" w:hAnsi="Times New Roman"/>
-          <w:iCs/>
-          <w:color w:val="000000"/>
-          <w:sz w:val="28"/>
-          <w:szCs w:val="28"/>
-          <w:lang w:eastAsia="ru-RU"/>
-        </w:rPr>
-      </w:r>
-    </w:p>
-    <w:p>
-      <w:pPr>
-        <w:pStyle w:val="ListParagraph"/>
-        <w:numPr>
-          <w:ilvl w:val="0"/>
-          <w:numId w:val="0"/>
-        </w:numPr>
-        <w:suppressAutoHyphens w:val="false"/>
-        <w:spacing w:lineRule="auto" w:line="288" w:before="0" w:after="0"/>
-        <w:ind w:hanging="0" w:start="0"/>
-        <w:contextualSpacing/>
-        <w:jc w:val="both"/>
-        <w:rPr>
-          <w:rFonts w:ascii="Times New Roman" w:hAnsi="Times New Roman" w:eastAsia="Times New Roman"/>
-          <w:iCs/>
-          <w:color w:val="000000"/>
-          <w:sz w:val="28"/>
-          <w:szCs w:val="28"/>
-          <w:lang w:eastAsia="ru-RU"/>
-        </w:rPr>
-      </w:pPr>
-      <w:r>
-        <w:rPr>
-          <w:rFonts w:eastAsia="Times New Roman" w:ascii="Times New Roman" w:hAnsi="Times New Roman"/>
-          <w:iCs/>
-          <w:color w:val="000000"/>
-          <w:sz w:val="28"/>
-          <w:szCs w:val="28"/>
-          <w:lang w:eastAsia="ru-RU"/>
-        </w:rPr>
+        <w:jc w:val="center"/>
+        <w:rPr>
+          <w:b/>
+          <w:bCs/>
+        </w:rPr>
+      </w:pPr>
+      <w:r>
+        <w:rPr>
+          <w:rFonts w:eastAsia="Times New Roman" w:ascii="Times New Roman" w:hAnsi="Times New Roman"/>
+          <w:b/>
+          <w:bCs/>
+          <w:iCs/>
+          <w:color w:val="000000"/>
+          <w:sz w:val="28"/>
+          <w:szCs w:val="28"/>
+          <w:lang w:eastAsia="ru-RU"/>
+        </w:rPr>
+      </w:r>
+    </w:p>
+    <w:p>
+      <w:pPr>
+        <w:pStyle w:val="Normal"/>
+        <w:spacing w:lineRule="auto" w:line="288" w:before="0" w:after="0"/>
+        <w:jc w:val="center"/>
+        <w:rPr>
+          <w:b/>
+          <w:bCs/>
+        </w:rPr>
+      </w:pPr>
+      <w:r>
+        <w:rPr>
+          <w:rFonts w:eastAsia="Times New Roman" w:ascii="Times New Roman" w:hAnsi="Times New Roman"/>
+          <w:b/>
+          <w:bCs/>
+          <w:iCs/>
+          <w:color w:val="000000"/>
+          <w:sz w:val="28"/>
+          <w:szCs w:val="28"/>
+          <w:lang w:eastAsia="ru-RU"/>
+        </w:rPr>
+      </w:r>
+    </w:p>
+    <w:p>
+      <w:pPr>
+        <w:pStyle w:val="Normal"/>
+        <w:spacing w:lineRule="auto" w:line="288" w:before="0" w:after="0"/>
+        <w:jc w:val="center"/>
+        <w:rPr>
+          <w:b/>
+          <w:bCs/>
+        </w:rPr>
+      </w:pPr>
+      <w:r>
+        <w:rPr>
+          <w:rFonts w:eastAsia="Times New Roman" w:ascii="Times New Roman" w:hAnsi="Times New Roman"/>
+          <w:b/>
+          <w:bCs/>
+          <w:iCs/>
+          <w:color w:val="000000"/>
+          <w:sz w:val="28"/>
+          <w:szCs w:val="28"/>
+          <w:lang w:eastAsia="ru-RU"/>
+        </w:rPr>
+      </w:r>
+    </w:p>
+    <w:p>
+      <w:pPr>
+        <w:pStyle w:val="Normal"/>
+        <w:spacing w:lineRule="auto" w:line="288" w:before="0" w:after="0"/>
+        <w:jc w:val="center"/>
+        <w:rPr>
+          <w:b/>
+          <w:bCs/>
+        </w:rPr>
+      </w:pPr>
+      <w:r>
+        <w:rPr>
+          <w:rFonts w:eastAsia="Times New Roman" w:ascii="Times New Roman" w:hAnsi="Times New Roman"/>
+          <w:b/>
+          <w:bCs/>
+          <w:iCs/>
+          <w:color w:val="000000"/>
+          <w:sz w:val="28"/>
+          <w:szCs w:val="28"/>
+          <w:lang w:eastAsia="ru-RU"/>
+        </w:rPr>
+      </w:r>
+    </w:p>
+    <w:p>
+      <w:pPr>
+        <w:pStyle w:val="Normal"/>
+        <w:spacing w:lineRule="auto" w:line="288" w:before="0" w:after="0"/>
+        <w:jc w:val="center"/>
+        <w:rPr>
+          <w:b/>
+          <w:bCs/>
+        </w:rPr>
+      </w:pPr>
+      <w:r>
+        <w:rPr>
+          <w:rFonts w:eastAsia="Times New Roman" w:ascii="Times New Roman" w:hAnsi="Times New Roman"/>
+          <w:b/>
+          <w:bCs/>
+          <w:iCs/>
+          <w:color w:val="000000"/>
+          <w:sz w:val="28"/>
+          <w:szCs w:val="28"/>
+          <w:lang w:eastAsia="ru-RU"/>
+        </w:rPr>
+      </w:r>
+    </w:p>
+    <w:p>
+      <w:pPr>
+        <w:pStyle w:val="Normal"/>
+        <w:spacing w:lineRule="auto" w:line="288" w:before="0" w:after="0"/>
+        <w:jc w:val="center"/>
+        <w:rPr>
+          <w:b/>
+          <w:bCs/>
+        </w:rPr>
+      </w:pPr>
+      <w:r>
+        <w:rPr>
+          <w:rFonts w:eastAsia="Times New Roman" w:ascii="Times New Roman" w:hAnsi="Times New Roman"/>
+          <w:b/>
+          <w:bCs/>
+          <w:iCs/>
+          <w:color w:val="000000"/>
+          <w:sz w:val="28"/>
+          <w:szCs w:val="28"/>
+          <w:lang w:eastAsia="ru-RU"/>
+        </w:rPr>
+      </w:r>
+    </w:p>
+    <w:p>
+      <w:pPr>
+        <w:pStyle w:val="Normal"/>
+        <w:spacing w:lineRule="auto" w:line="288" w:before="0" w:after="0"/>
+        <w:jc w:val="center"/>
+        <w:rPr>
+          <w:b/>
+          <w:bCs/>
+        </w:rPr>
+      </w:pPr>
+      <w:r>
+        <w:rPr>
+          <w:rFonts w:eastAsia="Times New Roman" w:ascii="Times New Roman" w:hAnsi="Times New Roman"/>
+          <w:b/>
+          <w:bCs/>
+          <w:iCs/>
+          <w:color w:val="000000"/>
+          <w:sz w:val="28"/>
+          <w:szCs w:val="28"/>
+          <w:lang w:eastAsia="ru-RU"/>
+        </w:rPr>
+      </w:r>
+    </w:p>
+    <w:p>
+      <w:pPr>
+        <w:pStyle w:val="Normal"/>
+        <w:spacing w:lineRule="auto" w:line="288" w:before="0" w:after="0"/>
+        <w:jc w:val="center"/>
+        <w:rPr>
+          <w:b/>
+          <w:bCs/>
+        </w:rPr>
+      </w:pPr>
+      <w:r>
+        <w:rPr>
+          <w:rFonts w:eastAsia="Times New Roman" w:ascii="Times New Roman" w:hAnsi="Times New Roman"/>
+          <w:b/>
+          <w:bCs/>
+          <w:iCs/>
+          <w:color w:val="000000"/>
+          <w:sz w:val="28"/>
+          <w:szCs w:val="28"/>
+          <w:lang w:eastAsia="ru-RU"/>
+        </w:rPr>
+      </w:r>
+    </w:p>
+    <w:p>
+      <w:pPr>
+        <w:pStyle w:val="Normal"/>
+        <w:spacing w:lineRule="auto" w:line="288" w:before="0" w:after="0"/>
+        <w:jc w:val="center"/>
+        <w:rPr>
+          <w:b/>
+          <w:bCs/>
+        </w:rPr>
+      </w:pPr>
+      <w:r>
+        <w:rPr>
+          <w:rFonts w:eastAsia="Times New Roman" w:ascii="Times New Roman" w:hAnsi="Times New Roman"/>
+          <w:b/>
+          <w:bCs/>
+          <w:iCs/>
+          <w:color w:val="000000"/>
+          <w:sz w:val="28"/>
+          <w:szCs w:val="28"/>
+          <w:lang w:eastAsia="ru-RU"/>
+        </w:rPr>
+      </w:r>
+    </w:p>
+    <w:p>
+      <w:pPr>
+        <w:pStyle w:val="Normal"/>
+        <w:spacing w:lineRule="auto" w:line="288" w:before="0" w:after="0"/>
+        <w:jc w:val="center"/>
+        <w:rPr>
+          <w:b/>
+          <w:bCs/>
+        </w:rPr>
+      </w:pPr>
+      <w:r>
+        <w:rPr>
+          <w:rFonts w:eastAsia="Times New Roman" w:ascii="Times New Roman" w:hAnsi="Times New Roman"/>
+          <w:b/>
+          <w:bCs/>
+          <w:iCs/>
+          <w:color w:val="000000"/>
+          <w:sz w:val="28"/>
+          <w:szCs w:val="28"/>
+          <w:lang w:eastAsia="ru-RU"/>
+        </w:rPr>
+      </w:r>
+    </w:p>
+    <w:p>
+      <w:pPr>
+        <w:pStyle w:val="Normal"/>
+        <w:spacing w:lineRule="auto" w:line="288" w:before="0" w:after="0"/>
+        <w:jc w:val="center"/>
+        <w:rPr>
+          <w:b/>
+          <w:bCs/>
+        </w:rPr>
+      </w:pPr>
+      <w:r>
+        <w:rPr>
+          <w:rFonts w:eastAsia="Times New Roman" w:ascii="Times New Roman" w:hAnsi="Times New Roman"/>
+          <w:b/>
+          <w:bCs/>
+          <w:iCs/>
+          <w:color w:val="000000"/>
+          <w:sz w:val="28"/>
+          <w:szCs w:val="28"/>
+          <w:lang w:eastAsia="ru-RU"/>
+        </w:rPr>
+      </w:r>
+    </w:p>
+    <w:p>
+      <w:pPr>
+        <w:pStyle w:val="Normal"/>
+        <w:spacing w:lineRule="auto" w:line="288" w:before="0" w:after="0"/>
+        <w:jc w:val="center"/>
+        <w:rPr>
+          <w:b/>
+          <w:bCs/>
+        </w:rPr>
+      </w:pPr>
+      <w:r>
+        <w:rPr>
+          <w:rFonts w:eastAsia="Times New Roman" w:ascii="Times New Roman" w:hAnsi="Times New Roman"/>
+          <w:b/>
+          <w:bCs/>
+          <w:iCs/>
+          <w:color w:val="000000"/>
+          <w:sz w:val="28"/>
+          <w:szCs w:val="28"/>
+          <w:lang w:eastAsia="ru-RU"/>
+        </w:rPr>
+      </w:r>
+    </w:p>
+    <w:p>
+      <w:pPr>
+        <w:pStyle w:val="Normal"/>
+        <w:spacing w:lineRule="auto" w:line="288" w:before="0" w:after="0"/>
+        <w:jc w:val="center"/>
+        <w:rPr>
+          <w:b/>
+          <w:bCs/>
+        </w:rPr>
+      </w:pPr>
+      <w:r>
+        <w:rPr>
+          <w:rFonts w:eastAsia="Times New Roman" w:ascii="Times New Roman" w:hAnsi="Times New Roman"/>
+          <w:b/>
+          <w:bCs/>
+          <w:iCs/>
+          <w:color w:val="000000"/>
+          <w:sz w:val="28"/>
+          <w:szCs w:val="28"/>
+          <w:lang w:eastAsia="ru-RU"/>
+        </w:rPr>
+      </w:r>
+    </w:p>
+    <w:p>
+      <w:pPr>
+        <w:pStyle w:val="Normal"/>
+        <w:spacing w:lineRule="auto" w:line="288" w:before="0" w:after="0"/>
+        <w:jc w:val="center"/>
+        <w:rPr>
+          <w:b/>
+          <w:bCs/>
+        </w:rPr>
+      </w:pPr>
+      <w:r>
+        <w:rPr>
+          <w:rFonts w:eastAsia="Times New Roman" w:ascii="Times New Roman" w:hAnsi="Times New Roman"/>
+          <w:b/>
+          <w:bCs/>
+          <w:iCs/>
+          <w:color w:val="000000"/>
+          <w:sz w:val="28"/>
+          <w:szCs w:val="28"/>
+          <w:lang w:eastAsia="ru-RU"/>
+        </w:rPr>
+      </w:r>
+    </w:p>
+    <w:p>
+      <w:pPr>
+        <w:pStyle w:val="Normal"/>
+        <w:spacing w:lineRule="auto" w:line="288" w:before="0" w:after="0"/>
+        <w:jc w:val="center"/>
+        <w:rPr>
+          <w:b/>
+          <w:bCs/>
+        </w:rPr>
+      </w:pPr>
+      <w:r>
+        <w:rPr>
+          <w:rFonts w:eastAsia="Times New Roman" w:ascii="Times New Roman" w:hAnsi="Times New Roman"/>
+          <w:b/>
+          <w:bCs/>
+          <w:iCs/>
+          <w:color w:val="000000"/>
+          <w:sz w:val="28"/>
+          <w:szCs w:val="28"/>
+          <w:lang w:eastAsia="ru-RU"/>
+        </w:rPr>
+      </w:r>
+    </w:p>
+    <w:p>
+      <w:pPr>
+        <w:pStyle w:val="Normal"/>
+        <w:spacing w:lineRule="auto" w:line="288" w:before="0" w:after="0"/>
+        <w:jc w:val="center"/>
+        <w:rPr>
+          <w:b/>
+          <w:bCs/>
+        </w:rPr>
+      </w:pPr>
+      <w:r>
+        <w:rPr>
+          <w:rFonts w:eastAsia="Times New Roman" w:ascii="Times New Roman" w:hAnsi="Times New Roman"/>
+          <w:b/>
+          <w:bCs/>
+          <w:iCs/>
+          <w:color w:val="000000"/>
+          <w:sz w:val="28"/>
+          <w:szCs w:val="28"/>
+          <w:lang w:eastAsia="ru-RU"/>
+        </w:rPr>
+      </w:r>
+    </w:p>
+    <w:p>
+      <w:pPr>
+        <w:pStyle w:val="Normal"/>
+        <w:spacing w:lineRule="auto" w:line="288" w:before="0" w:after="0"/>
+        <w:jc w:val="center"/>
+        <w:rPr>
+          <w:b/>
+          <w:bCs/>
+        </w:rPr>
+      </w:pPr>
+      <w:r>
+        <w:rPr>
+          <w:rFonts w:eastAsia="Times New Roman" w:ascii="Times New Roman" w:hAnsi="Times New Roman"/>
+          <w:b/>
+          <w:bCs/>
+          <w:iCs/>
+          <w:color w:val="000000"/>
+          <w:sz w:val="28"/>
+          <w:szCs w:val="28"/>
+          <w:lang w:eastAsia="ru-RU"/>
+        </w:rPr>
+      </w:r>
+    </w:p>
+    <w:p>
+      <w:pPr>
+        <w:pStyle w:val="Normal"/>
+        <w:spacing w:lineRule="auto" w:line="288" w:before="0" w:after="0"/>
+        <w:jc w:val="center"/>
+        <w:rPr>
+          <w:b/>
+          <w:bCs/>
+        </w:rPr>
+      </w:pPr>
+      <w:r>
+        <w:rPr>
+          <w:rFonts w:eastAsia="Times New Roman" w:ascii="Times New Roman" w:hAnsi="Times New Roman"/>
+          <w:b/>
+          <w:bCs/>
+          <w:iCs/>
+          <w:color w:val="000000"/>
+          <w:sz w:val="28"/>
+          <w:szCs w:val="28"/>
+          <w:lang w:eastAsia="ru-RU"/>
+        </w:rPr>
+      </w:r>
+    </w:p>
+    <w:p>
+      <w:pPr>
+        <w:pStyle w:val="Normal"/>
+        <w:spacing w:lineRule="auto" w:line="288" w:before="0" w:after="0"/>
+        <w:jc w:val="center"/>
+        <w:rPr>
+          <w:b/>
+          <w:bCs/>
+        </w:rPr>
+      </w:pPr>
+      <w:r>
+        <w:rPr>
+          <w:rFonts w:eastAsia="Times New Roman" w:ascii="Times New Roman" w:hAnsi="Times New Roman"/>
+          <w:b/>
+          <w:bCs/>
+          <w:iCs/>
+          <w:color w:val="000000"/>
+          <w:sz w:val="28"/>
+          <w:szCs w:val="28"/>
+          <w:lang w:eastAsia="ru-RU"/>
+        </w:rPr>
+      </w:r>
+    </w:p>
+    <w:p>
+      <w:pPr>
+        <w:pStyle w:val="Normal"/>
+        <w:spacing w:lineRule="auto" w:line="288" w:before="0" w:after="0"/>
+        <w:jc w:val="center"/>
+        <w:rPr>
+          <w:b/>
+          <w:bCs/>
+        </w:rPr>
+      </w:pPr>
+      <w:r>
+        <w:rPr>
+          <w:rFonts w:eastAsia="Times New Roman" w:ascii="Times New Roman" w:hAnsi="Times New Roman"/>
+          <w:b/>
+          <w:bCs/>
+          <w:iCs/>
+          <w:color w:val="000000"/>
+          <w:sz w:val="28"/>
+          <w:szCs w:val="28"/>
+          <w:lang w:eastAsia="ru-RU"/>
+        </w:rPr>
+      </w:r>
+    </w:p>
+    <w:p>
+      <w:pPr>
+        <w:pStyle w:val="Normal"/>
+        <w:spacing w:lineRule="auto" w:line="288" w:before="0" w:after="0"/>
+        <w:jc w:val="center"/>
+        <w:rPr>
+          <w:b/>
+          <w:bCs/>
+        </w:rPr>
+      </w:pPr>
+      <w:r>
+        <w:rPr>
+          <w:rFonts w:eastAsia="Times New Roman" w:ascii="Times New Roman" w:hAnsi="Times New Roman"/>
+          <w:b/>
+          <w:bCs/>
+          <w:iCs/>
+          <w:color w:val="000000"/>
+          <w:sz w:val="28"/>
+          <w:szCs w:val="28"/>
+          <w:lang w:eastAsia="ru-RU"/>
+        </w:rPr>
+      </w:r>
+    </w:p>
+    <w:p>
+      <w:pPr>
+        <w:pStyle w:val="Normal"/>
+        <w:spacing w:lineRule="auto" w:line="288" w:before="0" w:after="0"/>
+        <w:jc w:val="center"/>
+        <w:rPr>
+          <w:b/>
+          <w:bCs/>
+        </w:rPr>
+      </w:pPr>
+      <w:r>
+        <w:rPr>
+          <w:rFonts w:eastAsia="Times New Roman" w:ascii="Times New Roman" w:hAnsi="Times New Roman"/>
+          <w:b/>
+          <w:bCs/>
+          <w:iCs/>
+          <w:color w:val="000000"/>
+          <w:sz w:val="28"/>
+          <w:szCs w:val="28"/>
+          <w:lang w:eastAsia="ru-RU"/>
+        </w:rPr>
+      </w:r>
+    </w:p>
+    <w:p>
+      <w:pPr>
+        <w:pStyle w:val="Normal"/>
+        <w:spacing w:lineRule="auto" w:line="288" w:before="0" w:after="0"/>
+        <w:jc w:val="center"/>
+        <w:rPr>
+          <w:b/>
+          <w:bCs/>
+        </w:rPr>
+      </w:pPr>
+      <w:r>
+        <w:rPr>
+          <w:rFonts w:eastAsia="Times New Roman" w:ascii="Times New Roman" w:hAnsi="Times New Roman"/>
+          <w:b/>
+          <w:bCs/>
+          <w:iCs/>
+          <w:color w:val="000000"/>
+          <w:sz w:val="28"/>
+          <w:szCs w:val="28"/>
+          <w:lang w:eastAsia="ru-RU"/>
+        </w:rPr>
+      </w:r>
+    </w:p>
+    <w:p>
+      <w:pPr>
+        <w:pStyle w:val="Normal"/>
+        <w:spacing w:lineRule="auto" w:line="288" w:before="0" w:after="0"/>
+        <w:jc w:val="center"/>
+        <w:rPr>
+          <w:b/>
+          <w:bCs/>
+        </w:rPr>
+      </w:pPr>
+      <w:r>
+        <w:rPr>
+          <w:rFonts w:eastAsia="Times New Roman" w:ascii="Times New Roman" w:hAnsi="Times New Roman"/>
+          <w:b/>
+          <w:bCs/>
+          <w:iCs/>
+          <w:color w:val="000000"/>
+          <w:sz w:val="28"/>
+          <w:szCs w:val="28"/>
+          <w:lang w:eastAsia="ru-RU"/>
+        </w:rPr>
+      </w:r>
+    </w:p>
+    <w:p>
+      <w:pPr>
+        <w:pStyle w:val="Normal"/>
+        <w:spacing w:lineRule="auto" w:line="288" w:before="0" w:after="0"/>
+        <w:jc w:val="center"/>
+        <w:rPr>
+          <w:b/>
+          <w:bCs/>
+        </w:rPr>
+      </w:pPr>
+      <w:r>
+        <w:rPr>
+          <w:rFonts w:eastAsia="Times New Roman" w:ascii="Times New Roman" w:hAnsi="Times New Roman"/>
+          <w:b/>
+          <w:bCs/>
+          <w:iCs/>
+          <w:color w:val="000000"/>
+          <w:sz w:val="28"/>
+          <w:szCs w:val="28"/>
+          <w:lang w:eastAsia="ru-RU"/>
+        </w:rPr>
+      </w:r>
+    </w:p>
+    <w:p>
+      <w:pPr>
+        <w:pStyle w:val="Normal"/>
+        <w:spacing w:lineRule="auto" w:line="288" w:before="0" w:after="0"/>
+        <w:jc w:val="center"/>
+        <w:rPr>
+          <w:b/>
+          <w:bCs/>
+        </w:rPr>
+      </w:pPr>
+      <w:r>
+        <w:rPr>
+          <w:rFonts w:eastAsia="Times New Roman" w:ascii="Times New Roman" w:hAnsi="Times New Roman"/>
+          <w:b/>
+          <w:bCs/>
+          <w:iCs/>
+          <w:color w:val="000000"/>
+          <w:sz w:val="28"/>
+          <w:szCs w:val="28"/>
+          <w:lang w:eastAsia="ru-RU"/>
+        </w:rPr>
+      </w:r>
+    </w:p>
+    <w:p>
+      <w:pPr>
+        <w:pStyle w:val="Normal"/>
+        <w:spacing w:lineRule="auto" w:line="288" w:before="0" w:after="0"/>
+        <w:jc w:val="center"/>
+        <w:rPr>
+          <w:b/>
+          <w:bCs/>
+        </w:rPr>
+      </w:pPr>
+      <w:r>
+        <w:rPr>
+          <w:rFonts w:eastAsia="Times New Roman" w:ascii="Times New Roman" w:hAnsi="Times New Roman"/>
+          <w:b/>
+          <w:bCs/>
+          <w:iCs/>
+          <w:color w:val="000000"/>
+          <w:sz w:val="28"/>
+          <w:szCs w:val="28"/>
+          <w:lang w:eastAsia="ru-RU"/>
+        </w:rPr>
+      </w:r>
+    </w:p>
+    <w:p>
+      <w:pPr>
+        <w:pStyle w:val="Normal"/>
+        <w:spacing w:lineRule="auto" w:line="288" w:before="0" w:after="0"/>
+        <w:jc w:val="center"/>
+        <w:rPr>
+          <w:b/>
+          <w:bCs/>
+        </w:rPr>
+      </w:pPr>
+      <w:r>
+        <w:rPr>
+          <w:rFonts w:eastAsia="Times New Roman" w:ascii="Times New Roman" w:hAnsi="Times New Roman"/>
+          <w:b/>
+          <w:bCs/>
+          <w:iCs/>
+          <w:color w:val="000000"/>
+          <w:sz w:val="28"/>
+          <w:szCs w:val="28"/>
+          <w:lang w:eastAsia="ru-RU"/>
+        </w:rPr>
+      </w:r>
+    </w:p>
+    <w:p>
+      <w:pPr>
+        <w:pStyle w:val="Normal"/>
+        <w:spacing w:lineRule="auto" w:line="288" w:before="0" w:after="0"/>
+        <w:jc w:val="center"/>
+        <w:rPr>
+          <w:b/>
+          <w:bCs/>
+        </w:rPr>
+      </w:pPr>
+      <w:r>
+        <w:rPr>
+          <w:rFonts w:eastAsia="Times New Roman" w:ascii="Times New Roman" w:hAnsi="Times New Roman"/>
+          <w:b/>
+          <w:bCs/>
+          <w:iCs/>
+          <w:color w:val="000000"/>
+          <w:sz w:val="28"/>
+          <w:szCs w:val="28"/>
+          <w:lang w:eastAsia="ru-RU"/>
+        </w:rPr>
+      </w:r>
+    </w:p>
+    <w:p>
+      <w:pPr>
+        <w:pStyle w:val="Normal"/>
+        <w:spacing w:lineRule="auto" w:line="288" w:before="0" w:after="0"/>
+        <w:jc w:val="center"/>
+        <w:rPr>
+          <w:b/>
+          <w:bCs/>
+        </w:rPr>
+      </w:pPr>
+      <w:r>
+        <w:rPr>
+          <w:rFonts w:eastAsia="Times New Roman" w:ascii="Times New Roman" w:hAnsi="Times New Roman"/>
+          <w:b/>
+          <w:bCs/>
+          <w:iCs/>
+          <w:color w:val="000000"/>
+          <w:sz w:val="28"/>
+          <w:szCs w:val="28"/>
+          <w:lang w:eastAsia="ru-RU"/>
+        </w:rPr>
+      </w:r>
+    </w:p>
+    <w:p>
+      <w:pPr>
+        <w:pStyle w:val="Normal"/>
+        <w:spacing w:lineRule="auto" w:line="288" w:before="0" w:after="0"/>
+        <w:jc w:val="center"/>
+        <w:rPr>
+          <w:b/>
+          <w:bCs/>
+        </w:rPr>
+      </w:pPr>
+      <w:r>
+        <w:rPr>
+          <w:rFonts w:eastAsia="Times New Roman" w:ascii="Times New Roman" w:hAnsi="Times New Roman"/>
+          <w:b/>
+          <w:bCs/>
+          <w:iCs/>
+          <w:color w:val="000000"/>
+          <w:sz w:val="28"/>
+          <w:szCs w:val="28"/>
+          <w:lang w:eastAsia="ru-RU"/>
+        </w:rPr>
+      </w:r>
+    </w:p>
+    <w:p>
+      <w:pPr>
+        <w:pStyle w:val="Normal"/>
+        <w:spacing w:lineRule="auto" w:line="288" w:before="0" w:after="0"/>
+        <w:jc w:val="center"/>
+        <w:rPr>
+          <w:b/>
+          <w:bCs/>
+        </w:rPr>
+      </w:pPr>
+      <w:r>
+        <w:rPr>
+          <w:rFonts w:eastAsia="Times New Roman" w:ascii="Times New Roman" w:hAnsi="Times New Roman"/>
+          <w:b/>
+          <w:bCs/>
+          <w:iCs/>
+          <w:color w:val="000000"/>
+          <w:sz w:val="28"/>
+          <w:szCs w:val="28"/>
+          <w:lang w:eastAsia="ru-RU"/>
+        </w:rPr>
+      </w:r>
+    </w:p>
+    <w:p>
+      <w:pPr>
+        <w:pStyle w:val="Normal"/>
+        <w:spacing w:lineRule="auto" w:line="288" w:before="0" w:after="0"/>
+        <w:jc w:val="center"/>
+        <w:rPr>
+          <w:b/>
+          <w:bCs/>
+        </w:rPr>
+      </w:pPr>
+      <w:r>
+        <w:rPr>
+          <w:rFonts w:eastAsia="Times New Roman" w:ascii="Times New Roman" w:hAnsi="Times New Roman"/>
+          <w:b/>
+          <w:bCs/>
+          <w:iCs/>
+          <w:color w:val="000000"/>
+          <w:sz w:val="28"/>
+          <w:szCs w:val="28"/>
+          <w:lang w:eastAsia="ru-RU"/>
+        </w:rPr>
+        <w:drawing>
+          <wp:anchor distT="0" distB="0" distL="0" distR="0" simplePos="0" relativeHeight="8" behindDoc="0" locked="0" layoutInCell="0" allowOverlap="1">
+            <wp:simplePos x="0" y="0"/>
+            <wp:positionH relativeFrom="column">
+              <wp:align>center</wp:align>
+            </wp:positionH>
+            <wp:positionV relativeFrom="paragraph">
+              <wp:posOffset>635</wp:posOffset>
+            </wp:positionV>
+            <wp:extent cx="5940425" cy="3814445"/>
+            <wp:effectExtent l="0" t="0" r="0" b="0"/>
+            <wp:wrapSquare wrapText="largest"/>
+            <wp:docPr id="7" name="Image5"/>
+            <wp:cNvGraphicFramePr>
+              <a:graphicFrameLocks xmlns:a="http://schemas.openxmlformats.org/drawingml/2006/main" noChangeAspect="1"/>
+            </wp:cNvGraphicFramePr>
+            <a:graphic xmlns:a="http://schemas.openxmlformats.org/drawingml/2006/main">
+              <a:graphicData uri="http://schemas.openxmlformats.org/drawingml/2006/picture">
+                <pic:pic xmlns:pic="http://schemas.openxmlformats.org/drawingml/2006/picture">
+                  <pic:nvPicPr>
+                    <pic:cNvPr id="7" name="Image5"/>
+                    <pic:cNvPicPr>
+                      <a:picLocks noChangeAspect="1" noChangeArrowheads="1"/>
+                    </pic:cNvPicPr>
+                  </pic:nvPicPr>
+                  <pic:blipFill>
+                    <a:blip r:embed="rId8"/>
+                    <a:stretch>
+                      <a:fillRect/>
+                    </a:stretch>
+                  </pic:blipFill>
+                  <pic:spPr bwMode="auto">
+                    <a:xfrm>
+                      <a:off x="0" y="0"/>
+                      <a:ext cx="5940425" cy="3814445"/>
+                    </a:xfrm>
+                    <a:prstGeom prst="rect">
+                      <a:avLst/>
+                    </a:prstGeom>
+                    <a:noFill/>
+                  </pic:spPr>
+                </pic:pic>
+              </a:graphicData>
+            </a:graphic>
+          </wp:anchor>
+        </w:drawing>
       </w:r>
     </w:p>
     <w:sectPr>
@@ -5933,6 +6077,143 @@
   <w:abstractNum w:abstractNumId="5">
     <w:lvl w:ilvl="0">
       <w:start w:val="1"/>
+      <w:numFmt w:val="bullet"/>
+      <w:lvlText w:val=""/>
+      <w:lvlJc w:val="start"/>
+      <w:pPr>
+        <w:tabs>
+          <w:tab w:val="num" w:pos="720"/>
+        </w:tabs>
+        <w:ind w:start="720" w:hanging="360"/>
+      </w:pPr>
+      <w:rPr>
+        <w:rFonts w:ascii="Symbol" w:hAnsi="Symbol" w:cs="Symbol" w:hint="default"/>
+      </w:rPr>
+    </w:lvl>
+    <w:lvl w:ilvl="1">
+      <w:start w:val="1"/>
+      <w:numFmt w:val="bullet"/>
+      <w:lvlText w:val="◦"/>
+      <w:lvlJc w:val="start"/>
+      <w:pPr>
+        <w:tabs>
+          <w:tab w:val="num" w:pos="1080"/>
+        </w:tabs>
+        <w:ind w:start="1080" w:hanging="360"/>
+      </w:pPr>
+      <w:rPr>
+        <w:rFonts w:ascii="OpenSymbol" w:hAnsi="OpenSymbol" w:cs="OpenSymbol" w:hint="default"/>
+      </w:rPr>
+    </w:lvl>
+    <w:lvl w:ilvl="2">
+      <w:start w:val="1"/>
+      <w:numFmt w:val="bullet"/>
+      <w:lvlText w:val="▪"/>
+      <w:lvlJc w:val="start"/>
+      <w:pPr>
+        <w:tabs>
+          <w:tab w:val="num" w:pos="1440"/>
+        </w:tabs>
+        <w:ind w:start="1440" w:hanging="360"/>
+      </w:pPr>
+      <w:rPr>
+        <w:rFonts w:ascii="OpenSymbol" w:hAnsi="OpenSymbol" w:cs="OpenSymbol" w:hint="default"/>
+      </w:rPr>
+    </w:lvl>
+    <w:lvl w:ilvl="3">
+      <w:start w:val="1"/>
+      <w:numFmt w:val="bullet"/>
+      <w:lvlText w:val=""/>
+      <w:lvlJc w:val="start"/>
+      <w:pPr>
+        <w:tabs>
+          <w:tab w:val="num" w:pos="1800"/>
+        </w:tabs>
+        <w:ind w:start="1800" w:hanging="360"/>
+      </w:pPr>
+      <w:rPr>
+        <w:rFonts w:ascii="Symbol" w:hAnsi="Symbol" w:cs="Symbol" w:hint="default"/>
+      </w:rPr>
+    </w:lvl>
+    <w:lvl w:ilvl="4">
+      <w:start w:val="1"/>
+      <w:numFmt w:val="bullet"/>
+      <w:lvlText w:val="◦"/>
+      <w:lvlJc w:val="start"/>
+      <w:pPr>
+        <w:tabs>
+          <w:tab w:val="num" w:pos="2160"/>
+        </w:tabs>
+        <w:ind w:start="2160" w:hanging="360"/>
+      </w:pPr>
+      <w:rPr>
+        <w:rFonts w:ascii="OpenSymbol" w:hAnsi="OpenSymbol" w:cs="OpenSymbol" w:hint="default"/>
+      </w:rPr>
+    </w:lvl>
+    <w:lvl w:ilvl="5">
+      <w:start w:val="1"/>
+      <w:numFmt w:val="bullet"/>
+      <w:lvlText w:val="▪"/>
+      <w:lvlJc w:val="start"/>
+      <w:pPr>
+        <w:tabs>
+          <w:tab w:val="num" w:pos="2520"/>
+        </w:tabs>
+        <w:ind w:start="2520" w:hanging="360"/>
+      </w:pPr>
+      <w:rPr>
+        <w:rFonts w:ascii="OpenSymbol" w:hAnsi="OpenSymbol" w:cs="OpenSymbol" w:hint="default"/>
+      </w:rPr>
+    </w:lvl>
+    <w:lvl w:ilvl="6">
+      <w:start w:val="1"/>
+      <w:numFmt w:val="bullet"/>
+      <w:lvlText w:val=""/>
+      <w:lvlJc w:val="start"/>
+      <w:pPr>
+        <w:tabs>
+          <w:tab w:val="num" w:pos="2880"/>
+        </w:tabs>
+        <w:ind w:start="2880" w:hanging="360"/>
+      </w:pPr>
+      <w:rPr>
+        <w:rFonts w:ascii="Symbol" w:hAnsi="Symbol" w:cs="Symbol" w:hint="default"/>
+      </w:rPr>
+    </w:lvl>
+    <w:lvl w:ilvl="7">
+      <w:start w:val="1"/>
+      <w:numFmt w:val="bullet"/>
+      <w:lvlText w:val="◦"/>
+      <w:lvlJc w:val="start"/>
+      <w:pPr>
+        <w:tabs>
+          <w:tab w:val="num" w:pos="3240"/>
+        </w:tabs>
+        <w:ind w:start="3240" w:hanging="360"/>
+      </w:pPr>
+      <w:rPr>
+        <w:rFonts w:ascii="OpenSymbol" w:hAnsi="OpenSymbol" w:cs="OpenSymbol" w:hint="default"/>
+      </w:rPr>
+    </w:lvl>
+    <w:lvl w:ilvl="8">
+      <w:start w:val="1"/>
+      <w:numFmt w:val="bullet"/>
+      <w:lvlText w:val="▪"/>
+      <w:lvlJc w:val="start"/>
+      <w:pPr>
+        <w:tabs>
+          <w:tab w:val="num" w:pos="3600"/>
+        </w:tabs>
+        <w:ind w:start="3600" w:hanging="360"/>
+      </w:pPr>
+      <w:rPr>
+        <w:rFonts w:ascii="OpenSymbol" w:hAnsi="OpenSymbol" w:cs="OpenSymbol" w:hint="default"/>
+      </w:rPr>
+    </w:lvl>
+  </w:abstractNum>
+  <w:abstractNum w:abstractNumId="6">
+    <w:lvl w:ilvl="0">
+      <w:start w:val="1"/>
       <w:numFmt w:val="none"/>
       <w:suff w:val="nothing"/>
       <w:lvlText w:val=""/>
@@ -6063,6 +6344,9 @@
   </w:num>
   <w:num w:numId="5">
     <w:abstractNumId w:val="5"/>
+  </w:num>
+  <w:num w:numId="6">
+    <w:abstractNumId w:val="6"/>
   </w:num>
 </w:numbering>
 </file>
@@ -6642,8 +6926,8 @@
     <w:qFormat/>
     <w:rPr/>
   </w:style>
-  <w:style w:type="character" w:styleId="Bulletsuser">
-    <w:name w:val="Bullets (user)"/>
+  <w:style w:type="character" w:styleId="Bullets">
+    <w:name w:val="Bullets"/>
     <w:qFormat/>
     <w:rPr>
       <w:rFonts w:ascii="OpenSymbol" w:hAnsi="OpenSymbol" w:eastAsia="OpenSymbol" w:cs="OpenSymbol"/>

</xml_diff>